<commit_message>
Fix Task 1 merge: left-join book catalog instead of outer (record count was changing), and union Reading Kickoff checkouts as rows in the same checkout_id/book_id/checkout_date/return_date columns instead of separate columns (was cross-multiplying rows for members with multiple Kickoff visits)
</commit_message>
<xml_diff>
--- a/integrity_report.docx
+++ b/integrity_report.docx
@@ -34,7 +34,7 @@
           <w:iCs/>
           <w:color w:val="555555"/>
         </w:rPr>
-        <w:t xml:space="preserve">Source file: task1_combined_data.csv (425 records)   |   Output file: task2_cleaned_data.csv (411 records)</w:t>
+        <w:t xml:space="preserve">Source file: task1_combined_data.csv (435 records)   |   Output file: task2_cleaned_data.csv (422 records)</w:t>
       </w:r>
     </w:p>
     <w:p>
@@ -51,7 +51,7 @@
         <w:spacing w:after="120"/>
       </w:pPr>
       <w:r>
-        <w:t xml:space="preserve">The combined dataset produced in Task 1 (members, checkouts, book catalog, and Reading Kickoff sign-ups merged together) was reviewed column by column and record by record before being handed off for analysis. Four distinct quality problems were found: gaps in several columns, a set of exactly repeated checkout records, inconsistent spelling/casing in two text columns, and a handful of records that reference member IDs that do not exist in the registered members table. Each is documented below with what was found, where it appeared, how many records were affected, and the decision made to resolve it.</w:t>
+        <w:t xml:space="preserve">The combined dataset produced in Task 1 (members and database checkouts merged with book details, with Reading Kickoff checkouts unioned in as additional rows in the same checkout_id / book_id / checkout_date / return_date columns) was reviewed column by column and record by record before being handed off for analysis. Four distinct quality problems were found: gaps in several columns, a set of exactly repeated checkout records, inconsistent spelling/casing in two text columns, and a handful of records that reference member IDs that do not exist in the registered members table. Each is documented below with what was found, where it appeared, how many records were affected, and the decision made to resolve it.</w:t>
       </w:r>
     </w:p>
     <w:p>
@@ -68,7 +68,7 @@
         <w:spacing w:after="120"/>
       </w:pPr>
       <w:r>
-        <w:t xml:space="preserve">Every column with gaps was evaluated on its own. Numeric columns were checked for outliers first, then filled with the mean or median of the remaining values; text columns were filled with the most common value (the mode); and date columns were forward-filled only where a gap genuinely meant "never recorded" rather than something else. One row and one column type were excluded from filling entirely, for reasons explained below.</w:t>
+        <w:t xml:space="preserve">Every column with gaps was evaluated on its own. Numeric columns were checked for outliers first, then filled with the mean or median of the remaining values; text columns were filled with the most common value (the mode); and the one date column that was genuinely unrecorded (join_date) was forward-filled. Everywhere else, a gap already meant something specific on its own, so it was left blank rather than filled — the reasoning for each is below the table.</w:t>
       </w:r>
     </w:p>
     <w:p>
@@ -139,7 +139,7 @@
                 <w:bCs/>
                 <w:color w:val="FFFFFF"/>
               </w:rPr>
-              <w:t xml:space="preserve">Missing (of 411, after dedup/orphan removal)</w:t>
+              <w:t xml:space="preserve">Missing (of 422, after dedup/orphan removal)</w:t>
             </w:r>
           </w:p>
         </w:tc>
@@ -315,7 +315,7 @@
           </w:tcPr>
           <w:p>
             <w:r>
-              <w:t xml:space="preserve">Mean = 201.1 pages (a continuous measurement, so the mean is appropriate)</w:t>
+              <w:t xml:space="preserve">Mean = 201.5 pages (a continuous measurement, so the mean is appropriate)</w:t>
             </w:r>
           </w:p>
         </w:tc>
@@ -547,7 +547,7 @@
           </w:tcPr>
           <w:p>
             <w:r>
-              <w:t xml:space="preserve">6</w:t>
+              <w:t xml:space="preserve">7</w:t>
             </w:r>
           </w:p>
         </w:tc>
@@ -597,7 +597,7 @@
           </w:tcPr>
           <w:p>
             <w:r>
-              <w:t xml:space="preserve">return_date / checkout_date / checkout_id / book_id</w:t>
+              <w:t xml:space="preserve">checkout_id</w:t>
             </w:r>
           </w:p>
         </w:tc>
@@ -613,7 +613,7 @@
           </w:tcPr>
           <w:p>
             <w:r>
-              <w:t xml:space="preserve">18–85 each</w:t>
+              <w:t xml:space="preserve">39</w:t>
             </w:r>
           </w:p>
         </w:tc>
@@ -645,7 +645,7 @@
           </w:tcPr>
           <w:p>
             <w:r>
-              <w:t xml:space="preserve">Not filled: the blank is meaningful, not missing</w:t>
+              <w:t xml:space="preserve">Not filled: no database checkout exists for that row</w:t>
             </w:r>
           </w:p>
         </w:tc>
@@ -663,7 +663,7 @@
           </w:tcPr>
           <w:p>
             <w:r>
-              <w:t xml:space="preserve">kickoff_book_id / kickoff_checkout_date</w:t>
+              <w:t xml:space="preserve">book_id / checkout_date / source</w:t>
             </w:r>
           </w:p>
         </w:tc>
@@ -679,7 +679,7 @@
           </w:tcPr>
           <w:p>
             <w:r>
-              <w:t xml:space="preserve">329</w:t>
+              <w:t xml:space="preserve">18 each</w:t>
             </w:r>
           </w:p>
         </w:tc>
@@ -711,7 +711,7 @@
           </w:tcPr>
           <w:p>
             <w:r>
-              <w:t xml:space="preserve">Not filled: the blank is meaningful, not missing</w:t>
+              <w:t xml:space="preserve">Not filled: that member had no checkout activity of any kind</w:t>
             </w:r>
           </w:p>
         </w:tc>
@@ -729,7 +729,7 @@
           </w:tcPr>
           <w:p>
             <w:r>
-              <w:t xml:space="preserve">member_id</w:t>
+              <w:t xml:space="preserve">return_date</w:t>
             </w:r>
           </w:p>
         </w:tc>
@@ -745,7 +745,7 @@
           </w:tcPr>
           <w:p>
             <w:r>
-              <w:t xml:space="preserve">1</w:t>
+              <w:t xml:space="preserve">104</w:t>
             </w:r>
           </w:p>
         </w:tc>
@@ -761,7 +761,7 @@
           </w:tcPr>
           <w:p>
             <w:r>
-              <w:t xml:space="preserve">Row dropped, not filled</w:t>
+              <w:t xml:space="preserve">Left blank — see reasoning below</w:t>
             </w:r>
           </w:p>
         </w:tc>
@@ -777,7 +777,7 @@
           </w:tcPr>
           <w:p>
             <w:r>
-              <w:t xml:space="preserve">An identifier can’t be averaged or guessed; the row has no member or checkout information at all</w:t>
+              <w:t xml:space="preserve">Not filled: no checkout, a Kickoff loan (never tracked), or a loan still open</w:t>
             </w:r>
           </w:p>
         </w:tc>
@@ -811,7 +811,7 @@
         <w:spacing w:after="120" w:before="240"/>
       </w:pPr>
       <w:r>
-        <w:t xml:space="preserve">Why four column groups were deliberately left blank</w:t>
+        <w:t xml:space="preserve">Why checkout_id, book_id, checkout_date, return_date, and source were deliberately left blank</w:t>
       </w:r>
     </w:p>
     <w:p>
@@ -819,15 +819,7 @@
         <w:spacing w:after="120"/>
       </w:pPr>
       <w:r>
-        <w:t xml:space="preserve">return_date, checkout_date/checkout_id/book_id, and kickoff_book_id/kickoff_checkout_date all failed a simple test before filling was even considered: does the blank mean "unknown," or does it mean something specific on its own? In this dataset it’s the latter in every case — a blank return_date means the book is still checked out, a blank checkout_date means that member has never checked out a book, and a blank kickoff_checkout_date means that member didn’t sign up for the Reading Kickoff. Forward-filling any of these would not fill a gap — it would fabricate an event that didn’t happen (a return that didn’t occur, a checkout that never took place, a Kickoff visit the member never made), and it would do so with an arbitrary date borrowed from an unrelated row above it in the table. That risk is exactly why the fourth-column group’s decision differs from the others: mean/median/mode/ffill were applied everywhere a gap was truly unknown data, and withheld everywhere a gap was already the correct answer.</w:t>
-      </w:r>
-    </w:p>
-    <w:p>
-      <w:pPr>
-        <w:spacing w:after="120"/>
-      </w:pPr>
-      <w:r>
-        <w:t xml:space="preserve">The one row missing member_id was dropped rather than filled for a related but distinct reason: member_id is an identifier, not a measurement or a category, so there is no mean, median, or mode that means anything for it — and the row it belongs to (a catalog book that was never checked out) carries no other usable information either.</w:t>
+        <w:t xml:space="preserve">These columns all failed a simple test before filling was even considered: does the blank mean "unknown," or does it mean something specific on its own? In this dataset it’s the latter in every case. checkout_id is blank for 39 rows because no database checkout record exists for them (either the member never checked out a book at all, or the row is a Reading Kickoff loan, which was never assigned a checkout_id in the first place). book_id, checkout_date, and source are blank together for exactly the 18 members who have never checked out a book by any route — there is no event to describe. return_date is blank for 104 rows for three different valid reasons layered together: 18 members with no checkout at all, every Reading Kickoff loan (21 rows, since the sign-up sheet itself states Kickoff books "are not due back until the end of the summer, so no return date is recorded"), and a number of genuinely still-open database loans. Filling any of these would not close a gap — it would fabricate an event that didn’t happen, borrowing an arbitrary value from an unrelated row.</w:t>
       </w:r>
     </w:p>
     <w:p>
@@ -881,7 +873,7 @@
         <w:t xml:space="preserve">How big it was: </w:t>
       </w:r>
       <w:r>
-        <w:t xml:space="preserve">16 records affected (8 pairs of identical rows) out of 425.</w:t>
+        <w:t xml:space="preserve">16 records affected (8 pairs of identical rows) out of 435.</w:t>
       </w:r>
     </w:p>
     <w:p>
@@ -893,7 +885,7 @@
           <w:i/>
           <w:iCs/>
         </w:rPr>
-        <w:t xml:space="preserve">A separate, similar-looking pattern was checked and deliberately left alone: member 1041 has two checkouts and two Reading Kickoff sign-ups, so the merge produced four rows for that member. These four rows are not duplicates — each pairs a different real checkout with a different real Kickoff visit — so all four were kept.</w:t>
+        <w:t xml:space="preserve">A separate, similar-looking case was checked deliberately: member 1041 has two database checkouts and two Reading Kickoff sign-ups. Because Kickoff loans are stored as their own rows (using checkout_id = blank, rather than being merged sideways onto the member’s existing checkout rows), these four events land as four distinct rows with no overlap between them — so there was never a risk of the merge itself manufacturing a false duplicate here.</w:t>
       </w:r>
     </w:p>
     <w:p>
@@ -964,7 +956,7 @@
         <w:t xml:space="preserve">How big it was: </w:t>
       </w:r>
       <w:r>
-        <w:t xml:space="preserve">39 records had a non-standard form (19 "Maadi ", 16 "zamalek", 2 "HELIOPOLIS", 1 "Nasr  City", 1 "NASR CITY") out of 419 records with a neighborhood value.</w:t>
+        <w:t xml:space="preserve">34 records had a non-standard form (20 "Maadi ", 10 "zamalek", 2 "HELIOPOLIS", 1 "Nasr  City", 1 "NASR CITY") out of 430 records with a neighborhood value.</w:t>
       </w:r>
     </w:p>
     <w:p>
@@ -1018,7 +1010,7 @@
         <w:t xml:space="preserve">How big it was: </w:t>
       </w:r>
       <w:r>
-        <w:t xml:space="preserve">79 records had a non-standard case (46 "active", 32 "inactive", 1 "INACTIVE") out of 419 records with a status value.</w:t>
+        <w:t xml:space="preserve">81 records had a non-standard case (47 "active", 33 "inactive", 1 "INACTIVE") out of 430 records with a status value.</w:t>
       </w:r>
     </w:p>
     <w:p>
@@ -1104,7 +1096,7 @@
         <w:t xml:space="preserve">How big it was: </w:t>
       </w:r>
       <w:r>
-        <w:t xml:space="preserve">5 records out of 425 (1104 appears twice, 1150 once, 1201 twice).</w:t>
+        <w:t xml:space="preserve">5 records out of 435 (1104 appears twice, 1150 once, 1201 twice).</w:t>
       </w:r>
     </w:p>
     <w:p>
@@ -1245,7 +1237,7 @@
           </w:tcPr>
           <w:p>
             <w:r>
-              <w:t xml:space="preserve">1 record dropped; 149 values filled (grade/pages/publication_year/genre/publisher/join_date); 797 blanks kept as meaningful</w:t>
+              <w:t xml:space="preserve">150 values filled (grade/pages/publication_year/genre/publisher/join_date); 197 blank cells kept as meaningful (checkout_id/book_id/checkout_date/return_date/source)</w:t>
             </w:r>
           </w:p>
         </w:tc>
@@ -1345,7 +1337,7 @@
           </w:tcPr>
           <w:p>
             <w:r>
-              <w:t xml:space="preserve">118 records standardized (39 neighborhood + 79 status)</w:t>
+              <w:t xml:space="preserve">115 records standardized (34 neighborhood + 81 status)</w:t>
             </w:r>
           </w:p>
         </w:tc>
@@ -1427,7 +1419,7 @@
         <w:spacing w:after="120"/>
       </w:pPr>
       <w:r>
-        <w:t xml:space="preserve">Starting row count: 425. Final row count after cleaning: 411. The cleaned dataset is saved as task2_cleaned_data.csv and is ready for Task 3.</w:t>
+        <w:t xml:space="preserve">Starting row count: 435. Final row count after cleaning: 422 (8 removed as true duplicates, 5 removed as unregistered member_id). The cleaned dataset is saved as task2_cleaned_data.csv and is ready for Task 3.</w:t>
       </w:r>
     </w:p>
     <w:sectPr>

</xml_diff>